<commit_message>
Add commit history screenshot and update documentation index
</commit_message>
<xml_diff>
--- a/docs/deliverables/07_Development_Document.docx
+++ b/docs/deliverables/07_Development_Document.docx
@@ -15,7 +15,6 @@
           <w:docPartUnique/>
         </w:docPartObj>
       </w:sdtPr>
-      <w:sdtEndPr/>
       <w:sdtContent>
         <w:p>
           <w:pPr>
@@ -155,7 +154,6 @@
             </w:placeholder>
             <w:text/>
           </w:sdtPr>
-          <w:sdtEndPr/>
           <w:sdtContent>
             <w:p>
               <w:pPr>
@@ -269,7 +267,6 @@
                                     <w:calendar w:val="gregorian"/>
                                   </w:date>
                                 </w:sdtPr>
-                                <w:sdtEndPr/>
                                 <w:sdtContent>
                                   <w:p>
                                     <w:pPr>
@@ -314,7 +311,6 @@
                                     <w:id w:val="1390145197"/>
                                     <w:text/>
                                   </w:sdtPr>
-                                  <w:sdtEndPr/>
                                   <w:sdtContent>
                                     <w:r>
                                       <w:rPr>
@@ -344,7 +340,6 @@
                                     <w:id w:val="-726379553"/>
                                     <w:text/>
                                   </w:sdtPr>
-                                  <w:sdtEndPr/>
                                   <w:sdtContent>
                                     <w:r>
                                       <w:rPr>
@@ -402,7 +397,6 @@
                               <w:calendar w:val="gregorian"/>
                             </w:date>
                           </w:sdtPr>
-                          <w:sdtEndPr/>
                           <w:sdtContent>
                             <w:p>
                               <w:pPr>
@@ -447,7 +441,6 @@
                               <w:id w:val="1390145197"/>
                               <w:text/>
                             </w:sdtPr>
-                            <w:sdtEndPr/>
                             <w:sdtContent>
                               <w:r>
                                 <w:rPr>
@@ -477,7 +470,6 @@
                               <w:id w:val="-726379553"/>
                               <w:text/>
                             </w:sdtPr>
-                            <w:sdtEndPr/>
                             <w:sdtContent>
                               <w:r>
                                 <w:rPr>
@@ -910,7 +902,7 @@
         <w:pStyle w:val="Heading1"/>
         <w:pageBreakBefore/>
       </w:pPr>
-      <w:bookmarkStart w:id="0" w:name="_Toc242067398"/>
+      <w:bookmarkStart w:id="0" w:name="_Toc242073019"/>
       <w:r>
         <w:lastRenderedPageBreak/>
         <w:t>Document Control</w:t>
@@ -1745,13 +1737,19 @@
       <w:pPr>
         <w:pStyle w:val="Heading1"/>
         <w:pageBreakBefore/>
+        <w:tabs>
+          <w:tab w:val="left" w:pos="3282"/>
+        </w:tabs>
       </w:pPr>
-      <w:bookmarkStart w:id="1" w:name="_Toc242067399"/>
+      <w:bookmarkStart w:id="1" w:name="_Toc242073020"/>
       <w:r>
         <w:lastRenderedPageBreak/>
         <w:t>Contents</w:t>
       </w:r>
       <w:bookmarkEnd w:id="1"/>
+      <w:r>
+        <w:tab/>
+      </w:r>
     </w:p>
     <w:p>
       <w:pPr>
@@ -1778,7 +1776,7 @@
       <w:r>
         <w:fldChar w:fldCharType="separate"/>
       </w:r>
-      <w:hyperlink w:anchor="_Toc242067398" w:history="1">
+      <w:hyperlink w:anchor="_Toc242073019" w:history="1">
         <w:r>
           <w:rPr>
             <w:rStyle w:val="Hyperlink"/>
@@ -1805,7 +1803,7 @@
             <w:noProof/>
             <w:webHidden/>
           </w:rPr>
-          <w:instrText xml:space="preserve"> PAGEREF _Toc242067398 \h </w:instrText>
+          <w:instrText xml:space="preserve"> PAGEREF _Toc242073019 \h </w:instrText>
         </w:r>
         <w:r>
           <w:rPr>
@@ -1852,7 +1850,7 @@
           <w14:ligatures w14:val="standardContextual"/>
         </w:rPr>
       </w:pPr>
-      <w:hyperlink w:anchor="_Toc242067399" w:history="1">
+      <w:hyperlink w:anchor="_Toc242073020" w:history="1">
         <w:r>
           <w:rPr>
             <w:rStyle w:val="Hyperlink"/>
@@ -1879,7 +1877,7 @@
             <w:noProof/>
             <w:webHidden/>
           </w:rPr>
-          <w:instrText xml:space="preserve"> PAGEREF _Toc242067399 \h </w:instrText>
+          <w:instrText xml:space="preserve"> PAGEREF _Toc242073020 \h </w:instrText>
         </w:r>
         <w:r>
           <w:rPr>
@@ -1926,7 +1924,7 @@
           <w14:ligatures w14:val="standardContextual"/>
         </w:rPr>
       </w:pPr>
-      <w:hyperlink w:anchor="_Toc242067400" w:history="1">
+      <w:hyperlink w:anchor="_Toc242073021" w:history="1">
         <w:r>
           <w:rPr>
             <w:rStyle w:val="Hyperlink"/>
@@ -1953,7 +1951,7 @@
             <w:noProof/>
             <w:webHidden/>
           </w:rPr>
-          <w:instrText xml:space="preserve"> PAGEREF _Toc242067400 \h </w:instrText>
+          <w:instrText xml:space="preserve"> PAGEREF _Toc242073021 \h </w:instrText>
         </w:r>
         <w:r>
           <w:rPr>
@@ -2000,7 +1998,7 @@
           <w14:ligatures w14:val="standardContextual"/>
         </w:rPr>
       </w:pPr>
-      <w:hyperlink w:anchor="_Toc242067401" w:history="1">
+      <w:hyperlink w:anchor="_Toc242073022" w:history="1">
         <w:r>
           <w:rPr>
             <w:rStyle w:val="Hyperlink"/>
@@ -2027,7 +2025,7 @@
             <w:noProof/>
             <w:webHidden/>
           </w:rPr>
-          <w:instrText xml:space="preserve"> PAGEREF _Toc242067401 \h </w:instrText>
+          <w:instrText xml:space="preserve"> PAGEREF _Toc242073022 \h </w:instrText>
         </w:r>
         <w:r>
           <w:rPr>
@@ -2074,7 +2072,7 @@
           <w14:ligatures w14:val="standardContextual"/>
         </w:rPr>
       </w:pPr>
-      <w:hyperlink w:anchor="_Toc242067402" w:history="1">
+      <w:hyperlink w:anchor="_Toc242073023" w:history="1">
         <w:r>
           <w:rPr>
             <w:rStyle w:val="Hyperlink"/>
@@ -2101,7 +2099,7 @@
             <w:noProof/>
             <w:webHidden/>
           </w:rPr>
-          <w:instrText xml:space="preserve"> PAGEREF _Toc242067402 \h </w:instrText>
+          <w:instrText xml:space="preserve"> PAGEREF _Toc242073023 \h </w:instrText>
         </w:r>
         <w:r>
           <w:rPr>
@@ -2148,7 +2146,7 @@
           <w14:ligatures w14:val="standardContextual"/>
         </w:rPr>
       </w:pPr>
-      <w:hyperlink w:anchor="_Toc242067403" w:history="1">
+      <w:hyperlink w:anchor="_Toc242073024" w:history="1">
         <w:r>
           <w:rPr>
             <w:rStyle w:val="Hyperlink"/>
@@ -2175,7 +2173,7 @@
             <w:noProof/>
             <w:webHidden/>
           </w:rPr>
-          <w:instrText xml:space="preserve"> PAGEREF _Toc242067403 \h </w:instrText>
+          <w:instrText xml:space="preserve"> PAGEREF _Toc242073024 \h </w:instrText>
         </w:r>
         <w:r>
           <w:rPr>
@@ -2222,7 +2220,7 @@
           <w14:ligatures w14:val="standardContextual"/>
         </w:rPr>
       </w:pPr>
-      <w:hyperlink w:anchor="_Toc242067404" w:history="1">
+      <w:hyperlink w:anchor="_Toc242073025" w:history="1">
         <w:r>
           <w:rPr>
             <w:rStyle w:val="Hyperlink"/>
@@ -2249,7 +2247,7 @@
             <w:noProof/>
             <w:webHidden/>
           </w:rPr>
-          <w:instrText xml:space="preserve"> PAGEREF _Toc242067404 \h </w:instrText>
+          <w:instrText xml:space="preserve"> PAGEREF _Toc242073025 \h </w:instrText>
         </w:r>
         <w:r>
           <w:rPr>
@@ -2296,7 +2294,7 @@
           <w14:ligatures w14:val="standardContextual"/>
         </w:rPr>
       </w:pPr>
-      <w:hyperlink w:anchor="_Toc242067405" w:history="1">
+      <w:hyperlink w:anchor="_Toc242073026" w:history="1">
         <w:r>
           <w:rPr>
             <w:rStyle w:val="Hyperlink"/>
@@ -2323,7 +2321,7 @@
             <w:noProof/>
             <w:webHidden/>
           </w:rPr>
-          <w:instrText xml:space="preserve"> PAGEREF _Toc242067405 \h </w:instrText>
+          <w:instrText xml:space="preserve"> PAGEREF _Toc242073026 \h </w:instrText>
         </w:r>
         <w:r>
           <w:rPr>
@@ -2370,7 +2368,7 @@
           <w14:ligatures w14:val="standardContextual"/>
         </w:rPr>
       </w:pPr>
-      <w:hyperlink w:anchor="_Toc242067406" w:history="1">
+      <w:hyperlink w:anchor="_Toc242073027" w:history="1">
         <w:r>
           <w:rPr>
             <w:rStyle w:val="Hyperlink"/>
@@ -2397,7 +2395,7 @@
             <w:noProof/>
             <w:webHidden/>
           </w:rPr>
-          <w:instrText xml:space="preserve"> PAGEREF _Toc242067406 \h </w:instrText>
+          <w:instrText xml:space="preserve"> PAGEREF _Toc242073027 \h </w:instrText>
         </w:r>
         <w:r>
           <w:rPr>
@@ -2444,7 +2442,7 @@
           <w14:ligatures w14:val="standardContextual"/>
         </w:rPr>
       </w:pPr>
-      <w:hyperlink w:anchor="_Toc242067407" w:history="1">
+      <w:hyperlink w:anchor="_Toc242073028" w:history="1">
         <w:r>
           <w:rPr>
             <w:rStyle w:val="Hyperlink"/>
@@ -2471,7 +2469,7 @@
             <w:noProof/>
             <w:webHidden/>
           </w:rPr>
-          <w:instrText xml:space="preserve"> PAGEREF _Toc242067407 \h </w:instrText>
+          <w:instrText xml:space="preserve"> PAGEREF _Toc242073028 \h </w:instrText>
         </w:r>
         <w:r>
           <w:rPr>
@@ -2518,7 +2516,7 @@
           <w14:ligatures w14:val="standardContextual"/>
         </w:rPr>
       </w:pPr>
-      <w:hyperlink w:anchor="_Toc242067408" w:history="1">
+      <w:hyperlink w:anchor="_Toc242073029" w:history="1">
         <w:r>
           <w:rPr>
             <w:rStyle w:val="Hyperlink"/>
@@ -2545,7 +2543,7 @@
             <w:noProof/>
             <w:webHidden/>
           </w:rPr>
-          <w:instrText xml:space="preserve"> PAGEREF _Toc242067408 \h </w:instrText>
+          <w:instrText xml:space="preserve"> PAGEREF _Toc242073029 \h </w:instrText>
         </w:r>
         <w:r>
           <w:rPr>
@@ -2592,7 +2590,7 @@
           <w14:ligatures w14:val="standardContextual"/>
         </w:rPr>
       </w:pPr>
-      <w:hyperlink w:anchor="_Toc242067409" w:history="1">
+      <w:hyperlink w:anchor="_Toc242073030" w:history="1">
         <w:r>
           <w:rPr>
             <w:rStyle w:val="Hyperlink"/>
@@ -2619,7 +2617,7 @@
             <w:noProof/>
             <w:webHidden/>
           </w:rPr>
-          <w:instrText xml:space="preserve"> PAGEREF _Toc242067409 \h </w:instrText>
+          <w:instrText xml:space="preserve"> PAGEREF _Toc242073030 \h </w:instrText>
         </w:r>
         <w:r>
           <w:rPr>
@@ -2666,7 +2664,7 @@
           <w14:ligatures w14:val="standardContextual"/>
         </w:rPr>
       </w:pPr>
-      <w:hyperlink w:anchor="_Toc242067410" w:history="1">
+      <w:hyperlink w:anchor="_Toc242073031" w:history="1">
         <w:r>
           <w:rPr>
             <w:rStyle w:val="Hyperlink"/>
@@ -2693,7 +2691,7 @@
             <w:noProof/>
             <w:webHidden/>
           </w:rPr>
-          <w:instrText xml:space="preserve"> PAGEREF _Toc242067410 \h </w:instrText>
+          <w:instrText xml:space="preserve"> PAGEREF _Toc242073031 \h </w:instrText>
         </w:r>
         <w:r>
           <w:rPr>
@@ -2740,7 +2738,7 @@
           <w14:ligatures w14:val="standardContextual"/>
         </w:rPr>
       </w:pPr>
-      <w:hyperlink w:anchor="_Toc242067411" w:history="1">
+      <w:hyperlink w:anchor="_Toc242073032" w:history="1">
         <w:r>
           <w:rPr>
             <w:rStyle w:val="Hyperlink"/>
@@ -2767,7 +2765,7 @@
             <w:noProof/>
             <w:webHidden/>
           </w:rPr>
-          <w:instrText xml:space="preserve"> PAGEREF _Toc242067411 \h </w:instrText>
+          <w:instrText xml:space="preserve"> PAGEREF _Toc242073032 \h </w:instrText>
         </w:r>
         <w:r>
           <w:rPr>
@@ -2814,7 +2812,7 @@
           <w14:ligatures w14:val="standardContextual"/>
         </w:rPr>
       </w:pPr>
-      <w:hyperlink w:anchor="_Toc242067412" w:history="1">
+      <w:hyperlink w:anchor="_Toc242073033" w:history="1">
         <w:r>
           <w:rPr>
             <w:rStyle w:val="Hyperlink"/>
@@ -2841,7 +2839,7 @@
             <w:noProof/>
             <w:webHidden/>
           </w:rPr>
-          <w:instrText xml:space="preserve"> PAGEREF _Toc242067412 \h </w:instrText>
+          <w:instrText xml:space="preserve"> PAGEREF _Toc242073033 \h </w:instrText>
         </w:r>
         <w:r>
           <w:rPr>
@@ -2888,7 +2886,7 @@
           <w14:ligatures w14:val="standardContextual"/>
         </w:rPr>
       </w:pPr>
-      <w:hyperlink w:anchor="_Toc242067413" w:history="1">
+      <w:hyperlink w:anchor="_Toc242073034" w:history="1">
         <w:r>
           <w:rPr>
             <w:rStyle w:val="Hyperlink"/>
@@ -2915,7 +2913,7 @@
             <w:noProof/>
             <w:webHidden/>
           </w:rPr>
-          <w:instrText xml:space="preserve"> PAGEREF _Toc242067413 \h </w:instrText>
+          <w:instrText xml:space="preserve"> PAGEREF _Toc242073034 \h </w:instrText>
         </w:r>
         <w:r>
           <w:rPr>
@@ -2962,7 +2960,7 @@
           <w14:ligatures w14:val="standardContextual"/>
         </w:rPr>
       </w:pPr>
-      <w:hyperlink w:anchor="_Toc242067414" w:history="1">
+      <w:hyperlink w:anchor="_Toc242073035" w:history="1">
         <w:r>
           <w:rPr>
             <w:rStyle w:val="Hyperlink"/>
@@ -2989,7 +2987,7 @@
             <w:noProof/>
             <w:webHidden/>
           </w:rPr>
-          <w:instrText xml:space="preserve"> PAGEREF _Toc242067414 \h </w:instrText>
+          <w:instrText xml:space="preserve"> PAGEREF _Toc242073035 \h </w:instrText>
         </w:r>
         <w:r>
           <w:rPr>
@@ -3036,7 +3034,7 @@
           <w14:ligatures w14:val="standardContextual"/>
         </w:rPr>
       </w:pPr>
-      <w:hyperlink w:anchor="_Toc242067415" w:history="1">
+      <w:hyperlink w:anchor="_Toc242073036" w:history="1">
         <w:r>
           <w:rPr>
             <w:rStyle w:val="Hyperlink"/>
@@ -3063,7 +3061,7 @@
             <w:noProof/>
             <w:webHidden/>
           </w:rPr>
-          <w:instrText xml:space="preserve"> PAGEREF _Toc242067415 \h </w:instrText>
+          <w:instrText xml:space="preserve"> PAGEREF _Toc242073036 \h </w:instrText>
         </w:r>
         <w:r>
           <w:rPr>
@@ -3110,7 +3108,7 @@
           <w14:ligatures w14:val="standardContextual"/>
         </w:rPr>
       </w:pPr>
-      <w:hyperlink w:anchor="_Toc242067416" w:history="1">
+      <w:hyperlink w:anchor="_Toc242073037" w:history="1">
         <w:r>
           <w:rPr>
             <w:rStyle w:val="Hyperlink"/>
@@ -3137,7 +3135,7 @@
             <w:noProof/>
             <w:webHidden/>
           </w:rPr>
-          <w:instrText xml:space="preserve"> PAGEREF _Toc242067416 \h </w:instrText>
+          <w:instrText xml:space="preserve"> PAGEREF _Toc242073037 \h </w:instrText>
         </w:r>
         <w:r>
           <w:rPr>
@@ -3184,7 +3182,7 @@
           <w14:ligatures w14:val="standardContextual"/>
         </w:rPr>
       </w:pPr>
-      <w:hyperlink w:anchor="_Toc242067417" w:history="1">
+      <w:hyperlink w:anchor="_Toc242073038" w:history="1">
         <w:r>
           <w:rPr>
             <w:rStyle w:val="Hyperlink"/>
@@ -3211,7 +3209,7 @@
             <w:noProof/>
             <w:webHidden/>
           </w:rPr>
-          <w:instrText xml:space="preserve"> PAGEREF _Toc242067417 \h </w:instrText>
+          <w:instrText xml:space="preserve"> PAGEREF _Toc242073038 \h </w:instrText>
         </w:r>
         <w:r>
           <w:rPr>
@@ -3258,7 +3256,7 @@
           <w14:ligatures w14:val="standardContextual"/>
         </w:rPr>
       </w:pPr>
-      <w:hyperlink w:anchor="_Toc242067418" w:history="1">
+      <w:hyperlink w:anchor="_Toc242073039" w:history="1">
         <w:r>
           <w:rPr>
             <w:rStyle w:val="Hyperlink"/>
@@ -3285,7 +3283,7 @@
             <w:noProof/>
             <w:webHidden/>
           </w:rPr>
-          <w:instrText xml:space="preserve"> PAGEREF _Toc242067418 \h </w:instrText>
+          <w:instrText xml:space="preserve"> PAGEREF _Toc242073039 \h </w:instrText>
         </w:r>
         <w:r>
           <w:rPr>
@@ -3332,7 +3330,7 @@
           <w14:ligatures w14:val="standardContextual"/>
         </w:rPr>
       </w:pPr>
-      <w:hyperlink w:anchor="_Toc242067419" w:history="1">
+      <w:hyperlink w:anchor="_Toc242073040" w:history="1">
         <w:r>
           <w:rPr>
             <w:rStyle w:val="Hyperlink"/>
@@ -3359,7 +3357,7 @@
             <w:noProof/>
             <w:webHidden/>
           </w:rPr>
-          <w:instrText xml:space="preserve"> PAGEREF _Toc242067419 \h </w:instrText>
+          <w:instrText xml:space="preserve"> PAGEREF _Toc242073040 \h </w:instrText>
         </w:r>
         <w:r>
           <w:rPr>
@@ -3406,7 +3404,7 @@
           <w14:ligatures w14:val="standardContextual"/>
         </w:rPr>
       </w:pPr>
-      <w:hyperlink w:anchor="_Toc242067420" w:history="1">
+      <w:hyperlink w:anchor="_Toc242073041" w:history="1">
         <w:r>
           <w:rPr>
             <w:rStyle w:val="Hyperlink"/>
@@ -3433,7 +3431,7 @@
             <w:noProof/>
             <w:webHidden/>
           </w:rPr>
-          <w:instrText xml:space="preserve"> PAGEREF _Toc242067420 \h </w:instrText>
+          <w:instrText xml:space="preserve"> PAGEREF _Toc242073041 \h </w:instrText>
         </w:r>
         <w:r>
           <w:rPr>
@@ -3480,7 +3478,7 @@
           <w14:ligatures w14:val="standardContextual"/>
         </w:rPr>
       </w:pPr>
-      <w:hyperlink w:anchor="_Toc242067421" w:history="1">
+      <w:hyperlink w:anchor="_Toc242073042" w:history="1">
         <w:r>
           <w:rPr>
             <w:rStyle w:val="Hyperlink"/>
@@ -3507,7 +3505,7 @@
             <w:noProof/>
             <w:webHidden/>
           </w:rPr>
-          <w:instrText xml:space="preserve"> PAGEREF _Toc242067421 \h </w:instrText>
+          <w:instrText xml:space="preserve"> PAGEREF _Toc242073042 \h </w:instrText>
         </w:r>
         <w:r>
           <w:rPr>
@@ -3554,7 +3552,7 @@
           <w14:ligatures w14:val="standardContextual"/>
         </w:rPr>
       </w:pPr>
-      <w:hyperlink w:anchor="_Toc242067422" w:history="1">
+      <w:hyperlink w:anchor="_Toc242073043" w:history="1">
         <w:r>
           <w:rPr>
             <w:rStyle w:val="Hyperlink"/>
@@ -3581,7 +3579,7 @@
             <w:noProof/>
             <w:webHidden/>
           </w:rPr>
-          <w:instrText xml:space="preserve"> PAGEREF _Toc242067422 \h </w:instrText>
+          <w:instrText xml:space="preserve"> PAGEREF _Toc242073043 \h </w:instrText>
         </w:r>
         <w:r>
           <w:rPr>
@@ -3628,7 +3626,7 @@
           <w14:ligatures w14:val="standardContextual"/>
         </w:rPr>
       </w:pPr>
-      <w:hyperlink w:anchor="_Toc242067423" w:history="1">
+      <w:hyperlink w:anchor="_Toc242073044" w:history="1">
         <w:r>
           <w:rPr>
             <w:rStyle w:val="Hyperlink"/>
@@ -3655,7 +3653,7 @@
             <w:noProof/>
             <w:webHidden/>
           </w:rPr>
-          <w:instrText xml:space="preserve"> PAGEREF _Toc242067423 \h </w:instrText>
+          <w:instrText xml:space="preserve"> PAGEREF _Toc242073044 \h </w:instrText>
         </w:r>
         <w:r>
           <w:rPr>
@@ -3702,7 +3700,7 @@
           <w14:ligatures w14:val="standardContextual"/>
         </w:rPr>
       </w:pPr>
-      <w:hyperlink w:anchor="_Toc242067424" w:history="1">
+      <w:hyperlink w:anchor="_Toc242073045" w:history="1">
         <w:r>
           <w:rPr>
             <w:rStyle w:val="Hyperlink"/>
@@ -3729,7 +3727,7 @@
             <w:noProof/>
             <w:webHidden/>
           </w:rPr>
-          <w:instrText xml:space="preserve"> PAGEREF _Toc242067424 \h </w:instrText>
+          <w:instrText xml:space="preserve"> PAGEREF _Toc242073045 \h </w:instrText>
         </w:r>
         <w:r>
           <w:rPr>
@@ -3776,7 +3774,7 @@
           <w14:ligatures w14:val="standardContextual"/>
         </w:rPr>
       </w:pPr>
-      <w:hyperlink w:anchor="_Toc242067425" w:history="1">
+      <w:hyperlink w:anchor="_Toc242073046" w:history="1">
         <w:r>
           <w:rPr>
             <w:rStyle w:val="Hyperlink"/>
@@ -3803,7 +3801,7 @@
             <w:noProof/>
             <w:webHidden/>
           </w:rPr>
-          <w:instrText xml:space="preserve"> PAGEREF _Toc242067425 \h </w:instrText>
+          <w:instrText xml:space="preserve"> PAGEREF _Toc242073046 \h </w:instrText>
         </w:r>
         <w:r>
           <w:rPr>
@@ -3823,7 +3821,7 @@
             <w:noProof/>
             <w:webHidden/>
           </w:rPr>
-          <w:t>17</w:t>
+          <w:t>19</w:t>
         </w:r>
         <w:r>
           <w:rPr>
@@ -3844,7 +3842,7 @@
         <w:pStyle w:val="Heading1"/>
         <w:pageBreakBefore/>
       </w:pPr>
-      <w:bookmarkStart w:id="2" w:name="_Toc242067400"/>
+      <w:bookmarkStart w:id="2" w:name="_Toc242073021"/>
       <w:r>
         <w:lastRenderedPageBreak/>
         <w:t>List of Figures</w:t>
@@ -4083,6 +4081,80 @@
       </w:hyperlink>
     </w:p>
     <w:p>
+      <w:pPr>
+        <w:pStyle w:val="TableofFigures"/>
+        <w:tabs>
+          <w:tab w:val="right" w:leader="dot" w:pos="9402"/>
+        </w:tabs>
+        <w:rPr>
+          <w:rFonts w:asciiTheme="minorHAnsi" w:eastAsiaTheme="minorEastAsia" w:hAnsiTheme="minorHAnsi"/>
+          <w:noProof/>
+          <w:kern w:val="2"/>
+          <w:sz w:val="24"/>
+          <w:szCs w:val="24"/>
+          <w:lang w:val="en-MY" w:eastAsia="en-MY"/>
+          <w14:ligatures w14:val="standardContextual"/>
+        </w:rPr>
+      </w:pPr>
+      <w:hyperlink w:anchor="_Toc242067499" w:history="1">
+        <w:r>
+          <w:rPr>
+            <w:rStyle w:val="Hyperlink"/>
+            <w:noProof/>
+          </w:rPr>
+          <w:t>Figure 4: Commit history (git log) with the milestone tags</w:t>
+        </w:r>
+        <w:r>
+          <w:rPr>
+            <w:noProof/>
+            <w:webHidden/>
+          </w:rPr>
+          <w:tab/>
+        </w:r>
+        <w:r>
+          <w:rPr>
+            <w:noProof/>
+            <w:webHidden/>
+          </w:rPr>
+          <w:fldChar w:fldCharType="begin"/>
+        </w:r>
+        <w:r>
+          <w:rPr>
+            <w:noProof/>
+            <w:webHidden/>
+          </w:rPr>
+          <w:instrText xml:space="preserve"> PAGEREF _Toc242067499 \h </w:instrText>
+        </w:r>
+        <w:r>
+          <w:rPr>
+            <w:noProof/>
+            <w:webHidden/>
+          </w:rPr>
+        </w:r>
+        <w:r>
+          <w:rPr>
+            <w:noProof/>
+            <w:webHidden/>
+          </w:rPr>
+          <w:fldChar w:fldCharType="separate"/>
+        </w:r>
+        <w:r>
+          <w:rPr>
+            <w:noProof/>
+            <w:webHidden/>
+          </w:rPr>
+          <w:t>18</w:t>
+        </w:r>
+        <w:r>
+          <w:rPr>
+            <w:noProof/>
+            <w:webHidden/>
+          </w:rPr>
+          <w:fldChar w:fldCharType="end"/>
+        </w:r>
+      </w:hyperlink>
+    </w:p>
+    <w:p>
       <w:r>
         <w:fldChar w:fldCharType="end"/>
       </w:r>
@@ -4092,7 +4164,7 @@
         <w:pStyle w:val="Heading1"/>
         <w:pageBreakBefore/>
       </w:pPr>
-      <w:bookmarkStart w:id="3" w:name="_Toc242067401"/>
+      <w:bookmarkStart w:id="3" w:name="_Toc242073022"/>
       <w:r>
         <w:lastRenderedPageBreak/>
         <w:t>List of Tables</w:t>
@@ -4124,7 +4196,7 @@
       <w:r>
         <w:fldChar w:fldCharType="separate"/>
       </w:r>
-      <w:hyperlink w:anchor="_Toc242067429" w:history="1">
+      <w:hyperlink w:anchor="_Toc242073047" w:history="1">
         <w:r>
           <w:rPr>
             <w:rStyle w:val="Hyperlink"/>
@@ -4151,7 +4223,7 @@
             <w:noProof/>
             <w:webHidden/>
           </w:rPr>
-          <w:instrText xml:space="preserve"> PAGEREF _Toc242067429 \h </w:instrText>
+          <w:instrText xml:space="preserve"> PAGEREF _Toc242073047 \h </w:instrText>
         </w:r>
         <w:r>
           <w:rPr>
@@ -4198,7 +4270,7 @@
           <w14:ligatures w14:val="standardContextual"/>
         </w:rPr>
       </w:pPr>
-      <w:hyperlink w:anchor="_Toc242067430" w:history="1">
+      <w:hyperlink w:anchor="_Toc242073048" w:history="1">
         <w:r>
           <w:rPr>
             <w:rStyle w:val="Hyperlink"/>
@@ -4225,7 +4297,7 @@
             <w:noProof/>
             <w:webHidden/>
           </w:rPr>
-          <w:instrText xml:space="preserve"> PAGEREF _Toc242067430 \h </w:instrText>
+          <w:instrText xml:space="preserve"> PAGEREF _Toc242073048 \h </w:instrText>
         </w:r>
         <w:r>
           <w:rPr>
@@ -4272,7 +4344,7 @@
           <w14:ligatures w14:val="standardContextual"/>
         </w:rPr>
       </w:pPr>
-      <w:hyperlink w:anchor="_Toc242067431" w:history="1">
+      <w:hyperlink w:anchor="_Toc242073049" w:history="1">
         <w:r>
           <w:rPr>
             <w:rStyle w:val="Hyperlink"/>
@@ -4299,7 +4371,7 @@
             <w:noProof/>
             <w:webHidden/>
           </w:rPr>
-          <w:instrText xml:space="preserve"> PAGEREF _Toc242067431 \h </w:instrText>
+          <w:instrText xml:space="preserve"> PAGEREF _Toc242073049 \h </w:instrText>
         </w:r>
         <w:r>
           <w:rPr>
@@ -4346,7 +4418,7 @@
           <w14:ligatures w14:val="standardContextual"/>
         </w:rPr>
       </w:pPr>
-      <w:hyperlink w:anchor="_Toc242067432" w:history="1">
+      <w:hyperlink w:anchor="_Toc242073050" w:history="1">
         <w:r>
           <w:rPr>
             <w:rStyle w:val="Hyperlink"/>
@@ -4373,7 +4445,7 @@
             <w:noProof/>
             <w:webHidden/>
           </w:rPr>
-          <w:instrText xml:space="preserve"> PAGEREF _Toc242067432 \h </w:instrText>
+          <w:instrText xml:space="preserve"> PAGEREF _Toc242073050 \h </w:instrText>
         </w:r>
         <w:r>
           <w:rPr>
@@ -4420,7 +4492,7 @@
           <w14:ligatures w14:val="standardContextual"/>
         </w:rPr>
       </w:pPr>
-      <w:hyperlink w:anchor="_Toc242067433" w:history="1">
+      <w:hyperlink w:anchor="_Toc242073051" w:history="1">
         <w:r>
           <w:rPr>
             <w:rStyle w:val="Hyperlink"/>
@@ -4447,7 +4519,7 @@
             <w:noProof/>
             <w:webHidden/>
           </w:rPr>
-          <w:instrText xml:space="preserve"> PAGEREF _Toc242067433 \h </w:instrText>
+          <w:instrText xml:space="preserve"> PAGEREF _Toc242073051 \h </w:instrText>
         </w:r>
         <w:r>
           <w:rPr>
@@ -4494,7 +4566,7 @@
           <w14:ligatures w14:val="standardContextual"/>
         </w:rPr>
       </w:pPr>
-      <w:hyperlink w:anchor="_Toc242067434" w:history="1">
+      <w:hyperlink w:anchor="_Toc242073052" w:history="1">
         <w:r>
           <w:rPr>
             <w:rStyle w:val="Hyperlink"/>
@@ -4521,7 +4593,7 @@
             <w:noProof/>
             <w:webHidden/>
           </w:rPr>
-          <w:instrText xml:space="preserve"> PAGEREF _Toc242067434 \h </w:instrText>
+          <w:instrText xml:space="preserve"> PAGEREF _Toc242073052 \h </w:instrText>
         </w:r>
         <w:r>
           <w:rPr>
@@ -4568,7 +4640,7 @@
           <w14:ligatures w14:val="standardContextual"/>
         </w:rPr>
       </w:pPr>
-      <w:hyperlink w:anchor="_Toc242067435" w:history="1">
+      <w:hyperlink w:anchor="_Toc242073053" w:history="1">
         <w:r>
           <w:rPr>
             <w:rStyle w:val="Hyperlink"/>
@@ -4595,7 +4667,7 @@
             <w:noProof/>
             <w:webHidden/>
           </w:rPr>
-          <w:instrText xml:space="preserve"> PAGEREF _Toc242067435 \h </w:instrText>
+          <w:instrText xml:space="preserve"> PAGEREF _Toc242073053 \h </w:instrText>
         </w:r>
         <w:r>
           <w:rPr>
@@ -4642,7 +4714,7 @@
           <w14:ligatures w14:val="standardContextual"/>
         </w:rPr>
       </w:pPr>
-      <w:hyperlink w:anchor="_Toc242067436" w:history="1">
+      <w:hyperlink w:anchor="_Toc242073054" w:history="1">
         <w:r>
           <w:rPr>
             <w:rStyle w:val="Hyperlink"/>
@@ -4669,7 +4741,7 @@
             <w:noProof/>
             <w:webHidden/>
           </w:rPr>
-          <w:instrText xml:space="preserve"> PAGEREF _Toc242067436 \h </w:instrText>
+          <w:instrText xml:space="preserve"> PAGEREF _Toc242073054 \h </w:instrText>
         </w:r>
         <w:r>
           <w:rPr>
@@ -4716,7 +4788,7 @@
           <w14:ligatures w14:val="standardContextual"/>
         </w:rPr>
       </w:pPr>
-      <w:hyperlink w:anchor="_Toc242067437" w:history="1">
+      <w:hyperlink w:anchor="_Toc242073055" w:history="1">
         <w:r>
           <w:rPr>
             <w:rStyle w:val="Hyperlink"/>
@@ -4743,7 +4815,7 @@
             <w:noProof/>
             <w:webHidden/>
           </w:rPr>
-          <w:instrText xml:space="preserve"> PAGEREF _Toc242067437 \h </w:instrText>
+          <w:instrText xml:space="preserve"> PAGEREF _Toc242073055 \h </w:instrText>
         </w:r>
         <w:r>
           <w:rPr>
@@ -4790,7 +4862,7 @@
           <w14:ligatures w14:val="standardContextual"/>
         </w:rPr>
       </w:pPr>
-      <w:hyperlink w:anchor="_Toc242067438" w:history="1">
+      <w:hyperlink w:anchor="_Toc242073056" w:history="1">
         <w:r>
           <w:rPr>
             <w:rStyle w:val="Hyperlink"/>
@@ -4817,7 +4889,7 @@
             <w:noProof/>
             <w:webHidden/>
           </w:rPr>
-          <w:instrText xml:space="preserve"> PAGEREF _Toc242067438 \h </w:instrText>
+          <w:instrText xml:space="preserve"> PAGEREF _Toc242073056 \h </w:instrText>
         </w:r>
         <w:r>
           <w:rPr>
@@ -4864,7 +4936,7 @@
           <w14:ligatures w14:val="standardContextual"/>
         </w:rPr>
       </w:pPr>
-      <w:hyperlink w:anchor="_Toc242067439" w:history="1">
+      <w:hyperlink w:anchor="_Toc242073057" w:history="1">
         <w:r>
           <w:rPr>
             <w:rStyle w:val="Hyperlink"/>
@@ -4891,7 +4963,7 @@
             <w:noProof/>
             <w:webHidden/>
           </w:rPr>
-          <w:instrText xml:space="preserve"> PAGEREF _Toc242067439 \h </w:instrText>
+          <w:instrText xml:space="preserve"> PAGEREF _Toc242073057 \h </w:instrText>
         </w:r>
         <w:r>
           <w:rPr>
@@ -4938,7 +5010,7 @@
           <w14:ligatures w14:val="standardContextual"/>
         </w:rPr>
       </w:pPr>
-      <w:hyperlink w:anchor="_Toc242067440" w:history="1">
+      <w:hyperlink w:anchor="_Toc242073058" w:history="1">
         <w:r>
           <w:rPr>
             <w:rStyle w:val="Hyperlink"/>
@@ -4965,7 +5037,7 @@
             <w:noProof/>
             <w:webHidden/>
           </w:rPr>
-          <w:instrText xml:space="preserve"> PAGEREF _Toc242067440 \h </w:instrText>
+          <w:instrText xml:space="preserve"> PAGEREF _Toc242073058 \h </w:instrText>
         </w:r>
         <w:r>
           <w:rPr>
@@ -5012,7 +5084,7 @@
           <w14:ligatures w14:val="standardContextual"/>
         </w:rPr>
       </w:pPr>
-      <w:hyperlink w:anchor="_Toc242067441" w:history="1">
+      <w:hyperlink w:anchor="_Toc242073059" w:history="1">
         <w:r>
           <w:rPr>
             <w:rStyle w:val="Hyperlink"/>
@@ -5039,7 +5111,7 @@
             <w:noProof/>
             <w:webHidden/>
           </w:rPr>
-          <w:instrText xml:space="preserve"> PAGEREF _Toc242067441 \h </w:instrText>
+          <w:instrText xml:space="preserve"> PAGEREF _Toc242073059 \h </w:instrText>
         </w:r>
         <w:r>
           <w:rPr>
@@ -5086,7 +5158,7 @@
           <w14:ligatures w14:val="standardContextual"/>
         </w:rPr>
       </w:pPr>
-      <w:hyperlink w:anchor="_Toc242067442" w:history="1">
+      <w:hyperlink w:anchor="_Toc242073060" w:history="1">
         <w:r>
           <w:rPr>
             <w:rStyle w:val="Hyperlink"/>
@@ -5113,7 +5185,7 @@
             <w:noProof/>
             <w:webHidden/>
           </w:rPr>
-          <w:instrText xml:space="preserve"> PAGEREF _Toc242067442 \h </w:instrText>
+          <w:instrText xml:space="preserve"> PAGEREF _Toc242073060 \h </w:instrText>
         </w:r>
         <w:r>
           <w:rPr>
@@ -5160,7 +5232,7 @@
           <w14:ligatures w14:val="standardContextual"/>
         </w:rPr>
       </w:pPr>
-      <w:hyperlink w:anchor="_Toc242067443" w:history="1">
+      <w:hyperlink w:anchor="_Toc242073061" w:history="1">
         <w:r>
           <w:rPr>
             <w:rStyle w:val="Hyperlink"/>
@@ -5187,7 +5259,7 @@
             <w:noProof/>
             <w:webHidden/>
           </w:rPr>
-          <w:instrText xml:space="preserve"> PAGEREF _Toc242067443 \h </w:instrText>
+          <w:instrText xml:space="preserve"> PAGEREF _Toc242073061 \h </w:instrText>
         </w:r>
         <w:r>
           <w:rPr>
@@ -5234,7 +5306,7 @@
           <w14:ligatures w14:val="standardContextual"/>
         </w:rPr>
       </w:pPr>
-      <w:hyperlink w:anchor="_Toc242067444" w:history="1">
+      <w:hyperlink w:anchor="_Toc242073062" w:history="1">
         <w:r>
           <w:rPr>
             <w:rStyle w:val="Hyperlink"/>
@@ -5261,7 +5333,7 @@
             <w:noProof/>
             <w:webHidden/>
           </w:rPr>
-          <w:instrText xml:space="preserve"> PAGEREF _Toc242067444 \h </w:instrText>
+          <w:instrText xml:space="preserve"> PAGEREF _Toc242073062 \h </w:instrText>
         </w:r>
         <w:r>
           <w:rPr>
@@ -5308,7 +5380,7 @@
           <w14:ligatures w14:val="standardContextual"/>
         </w:rPr>
       </w:pPr>
-      <w:hyperlink w:anchor="_Toc242067445" w:history="1">
+      <w:hyperlink w:anchor="_Toc242073063" w:history="1">
         <w:r>
           <w:rPr>
             <w:rStyle w:val="Hyperlink"/>
@@ -5335,7 +5407,7 @@
             <w:noProof/>
             <w:webHidden/>
           </w:rPr>
-          <w:instrText xml:space="preserve"> PAGEREF _Toc242067445 \h </w:instrText>
+          <w:instrText xml:space="preserve"> PAGEREF _Toc242073063 \h </w:instrText>
         </w:r>
         <w:r>
           <w:rPr>
@@ -5382,7 +5454,7 @@
           <w14:ligatures w14:val="standardContextual"/>
         </w:rPr>
       </w:pPr>
-      <w:hyperlink w:anchor="_Toc242067446" w:history="1">
+      <w:hyperlink w:anchor="_Toc242073064" w:history="1">
         <w:r>
           <w:rPr>
             <w:rStyle w:val="Hyperlink"/>
@@ -5409,7 +5481,7 @@
             <w:noProof/>
             <w:webHidden/>
           </w:rPr>
-          <w:instrText xml:space="preserve"> PAGEREF _Toc242067446 \h </w:instrText>
+          <w:instrText xml:space="preserve"> PAGEREF _Toc242073064 \h </w:instrText>
         </w:r>
         <w:r>
           <w:rPr>
@@ -5456,7 +5528,7 @@
           <w14:ligatures w14:val="standardContextual"/>
         </w:rPr>
       </w:pPr>
-      <w:hyperlink w:anchor="_Toc242067447" w:history="1">
+      <w:hyperlink w:anchor="_Toc242073065" w:history="1">
         <w:r>
           <w:rPr>
             <w:rStyle w:val="Hyperlink"/>
@@ -5483,7 +5555,7 @@
             <w:noProof/>
             <w:webHidden/>
           </w:rPr>
-          <w:instrText xml:space="preserve"> PAGEREF _Toc242067447 \h </w:instrText>
+          <w:instrText xml:space="preserve"> PAGEREF _Toc242073065 \h </w:instrText>
         </w:r>
         <w:r>
           <w:rPr>
@@ -5503,7 +5575,7 @@
             <w:noProof/>
             <w:webHidden/>
           </w:rPr>
-          <w:t>17</w:t>
+          <w:t>19</w:t>
         </w:r>
         <w:r>
           <w:rPr>
@@ -5528,7 +5600,7 @@
       <w:pPr>
         <w:pStyle w:val="Heading1"/>
       </w:pPr>
-      <w:bookmarkStart w:id="4" w:name="_Toc242067402"/>
+      <w:bookmarkStart w:id="4" w:name="_Toc242073023"/>
       <w:r>
         <w:lastRenderedPageBreak/>
         <w:t>1. Introduction</w:t>
@@ -5539,7 +5611,7 @@
       <w:pPr>
         <w:pStyle w:val="Heading2"/>
       </w:pPr>
-      <w:bookmarkStart w:id="5" w:name="_Toc242067403"/>
+      <w:bookmarkStart w:id="5" w:name="_Toc242073024"/>
       <w:r>
         <w:t>1.1 Purpose</w:t>
       </w:r>
@@ -5554,7 +5626,7 @@
       <w:pPr>
         <w:pStyle w:val="Heading2"/>
       </w:pPr>
-      <w:bookmarkStart w:id="6" w:name="_Toc242067404"/>
+      <w:bookmarkStart w:id="6" w:name="_Toc242073025"/>
       <w:r>
         <w:t>1.2 Scope</w:t>
       </w:r>
@@ -5598,7 +5670,7 @@
       <w:pPr>
         <w:pStyle w:val="Heading2"/>
       </w:pPr>
-      <w:bookmarkStart w:id="7" w:name="_Toc242067405"/>
+      <w:bookmarkStart w:id="7" w:name="_Toc242073026"/>
       <w:r>
         <w:t>1.3 Intended Audience</w:t>
       </w:r>
@@ -5609,7 +5681,7 @@
         <w:pStyle w:val="Caption"/>
         <w:keepNext/>
       </w:pPr>
-      <w:bookmarkStart w:id="8" w:name="_Toc242067429"/>
+      <w:bookmarkStart w:id="8" w:name="_Toc242073047"/>
       <w:r>
         <w:t xml:space="preserve">Table </w:t>
       </w:r>
@@ -5765,7 +5837,7 @@
       <w:pPr>
         <w:pStyle w:val="Heading2"/>
       </w:pPr>
-      <w:bookmarkStart w:id="9" w:name="_Toc242067406"/>
+      <w:bookmarkStart w:id="9" w:name="_Toc242073027"/>
       <w:r>
         <w:t>1.4 Definitions &amp; Acronyms</w:t>
       </w:r>
@@ -5776,7 +5848,7 @@
         <w:pStyle w:val="Caption"/>
         <w:keepNext/>
       </w:pPr>
-      <w:bookmarkStart w:id="10" w:name="_Toc242067430"/>
+      <w:bookmarkStart w:id="10" w:name="_Toc242073048"/>
       <w:r>
         <w:t xml:space="preserve">Table </w:t>
       </w:r>
@@ -6388,7 +6460,7 @@
       <w:pPr>
         <w:pStyle w:val="Heading1"/>
       </w:pPr>
-      <w:bookmarkStart w:id="11" w:name="_Toc242067407"/>
+      <w:bookmarkStart w:id="11" w:name="_Toc242073028"/>
       <w:r>
         <w:lastRenderedPageBreak/>
         <w:t>2. Development Environment</w:t>
@@ -6400,7 +6472,7 @@
         <w:pStyle w:val="Caption"/>
         <w:keepNext/>
       </w:pPr>
-      <w:bookmarkStart w:id="12" w:name="_Toc242067431"/>
+      <w:bookmarkStart w:id="12" w:name="_Toc242073049"/>
       <w:r>
         <w:t xml:space="preserve">Table </w:t>
       </w:r>
@@ -6782,7 +6854,7 @@
       <w:pPr>
         <w:pStyle w:val="Heading1"/>
       </w:pPr>
-      <w:bookmarkStart w:id="13" w:name="_Toc242067408"/>
+      <w:bookmarkStart w:id="13" w:name="_Toc242073029"/>
       <w:r>
         <w:t>3. Repository Structure</w:t>
       </w:r>
@@ -6793,7 +6865,7 @@
         <w:pStyle w:val="Caption"/>
         <w:keepNext/>
       </w:pPr>
-      <w:bookmarkStart w:id="14" w:name="_Toc242067432"/>
+      <w:bookmarkStart w:id="14" w:name="_Toc242073050"/>
       <w:r>
         <w:t xml:space="preserve">Table </w:t>
       </w:r>
@@ -7181,7 +7253,7 @@
       <w:pPr>
         <w:pStyle w:val="Heading1"/>
       </w:pPr>
-      <w:bookmarkStart w:id="16" w:name="_Toc242067409"/>
+      <w:bookmarkStart w:id="16" w:name="_Toc242073030"/>
       <w:r>
         <w:lastRenderedPageBreak/>
         <w:t>4. Configuration</w:t>
@@ -7193,7 +7265,7 @@
         <w:pStyle w:val="Caption"/>
         <w:keepNext/>
       </w:pPr>
-      <w:bookmarkStart w:id="17" w:name="_Toc242067433"/>
+      <w:bookmarkStart w:id="17" w:name="_Toc242073051"/>
       <w:r>
         <w:t xml:space="preserve">Table </w:t>
       </w:r>
@@ -7871,7 +7943,7 @@
       <w:pPr>
         <w:pStyle w:val="Heading1"/>
       </w:pPr>
-      <w:bookmarkStart w:id="18" w:name="_Toc242067410"/>
+      <w:bookmarkStart w:id="18" w:name="_Toc242073031"/>
       <w:r>
         <w:t>5. Coding Standards &amp; Naming Conventions</w:t>
       </w:r>
@@ -7882,7 +7954,7 @@
         <w:pStyle w:val="Caption"/>
         <w:keepNext/>
       </w:pPr>
-      <w:bookmarkStart w:id="19" w:name="_Toc242067434"/>
+      <w:bookmarkStart w:id="19" w:name="_Toc242073052"/>
       <w:r>
         <w:t xml:space="preserve">Table </w:t>
       </w:r>
@@ -8119,7 +8191,7 @@
       <w:pPr>
         <w:pStyle w:val="Heading1"/>
       </w:pPr>
-      <w:bookmarkStart w:id="20" w:name="_Toc242067411"/>
+      <w:bookmarkStart w:id="20" w:name="_Toc242073032"/>
       <w:r>
         <w:lastRenderedPageBreak/>
         <w:t>6. Component Specifications</w:t>
@@ -8130,7 +8202,7 @@
       <w:pPr>
         <w:pStyle w:val="Heading2"/>
       </w:pPr>
-      <w:bookmarkStart w:id="21" w:name="_Toc242067412"/>
+      <w:bookmarkStart w:id="21" w:name="_Toc242073033"/>
       <w:r>
         <w:t>6.1 Data Generators (master, transaction, CDC)</w:t>
       </w:r>
@@ -8141,7 +8213,7 @@
         <w:pStyle w:val="Caption"/>
         <w:keepNext/>
       </w:pPr>
-      <w:bookmarkStart w:id="22" w:name="_Toc242067435"/>
+      <w:bookmarkStart w:id="22" w:name="_Toc242073053"/>
       <w:r>
         <w:t xml:space="preserve">Table </w:t>
       </w:r>
@@ -8458,7 +8530,7 @@
       <w:pPr>
         <w:pStyle w:val="Heading2"/>
       </w:pPr>
-      <w:bookmarkStart w:id="23" w:name="_Toc242067413"/>
+      <w:bookmarkStart w:id="23" w:name="_Toc242073034"/>
       <w:r>
         <w:t>6.2 SQL Server Pipeline</w:t>
       </w:r>
@@ -8469,7 +8541,7 @@
         <w:pStyle w:val="Caption"/>
         <w:keepNext/>
       </w:pPr>
-      <w:bookmarkStart w:id="24" w:name="_Toc242067436"/>
+      <w:bookmarkStart w:id="24" w:name="_Toc242073054"/>
       <w:r>
         <w:t xml:space="preserve">Table </w:t>
       </w:r>
@@ -8786,7 +8858,7 @@
       <w:pPr>
         <w:pStyle w:val="Heading2"/>
       </w:pPr>
-      <w:bookmarkStart w:id="25" w:name="_Toc242067414"/>
+      <w:bookmarkStart w:id="25" w:name="_Toc242073035"/>
       <w:r>
         <w:t>6.3 Marketing Leads Pipeline</w:t>
       </w:r>
@@ -8797,7 +8869,7 @@
         <w:pStyle w:val="Caption"/>
         <w:keepNext/>
       </w:pPr>
-      <w:bookmarkStart w:id="26" w:name="_Toc242067437"/>
+      <w:bookmarkStart w:id="26" w:name="_Toc242073055"/>
       <w:r>
         <w:t xml:space="preserve">Table </w:t>
       </w:r>
@@ -9114,7 +9186,7 @@
       <w:pPr>
         <w:pStyle w:val="Heading2"/>
       </w:pPr>
-      <w:bookmarkStart w:id="27" w:name="_Toc242067415"/>
+      <w:bookmarkStart w:id="27" w:name="_Toc242073036"/>
       <w:r>
         <w:t>6.4 Web Logs Pipeline</w:t>
       </w:r>
@@ -9125,7 +9197,7 @@
         <w:pStyle w:val="Caption"/>
         <w:keepNext/>
       </w:pPr>
-      <w:bookmarkStart w:id="28" w:name="_Toc242067438"/>
+      <w:bookmarkStart w:id="28" w:name="_Toc242073056"/>
       <w:r>
         <w:t xml:space="preserve">Table </w:t>
       </w:r>
@@ -9442,7 +9514,7 @@
       <w:pPr>
         <w:pStyle w:val="Heading2"/>
       </w:pPr>
-      <w:bookmarkStart w:id="29" w:name="_Toc242067416"/>
+      <w:bookmarkStart w:id="29" w:name="_Toc242073037"/>
       <w:r>
         <w:t>6.5 Orchestrator (run_pipeline.py)</w:t>
       </w:r>
@@ -9453,7 +9525,7 @@
         <w:pStyle w:val="Caption"/>
         <w:keepNext/>
       </w:pPr>
-      <w:bookmarkStart w:id="30" w:name="_Toc242067439"/>
+      <w:bookmarkStart w:id="30" w:name="_Toc242073057"/>
       <w:r>
         <w:t xml:space="preserve">Table </w:t>
       </w:r>
@@ -9770,7 +9842,7 @@
       <w:pPr>
         <w:pStyle w:val="Heading2"/>
       </w:pPr>
-      <w:bookmarkStart w:id="31" w:name="_Toc242067417"/>
+      <w:bookmarkStart w:id="31" w:name="_Toc242073038"/>
       <w:r>
         <w:t>6.6 Utilities (logging, notifier, pipeline utils)</w:t>
       </w:r>
@@ -9781,7 +9853,7 @@
         <w:pStyle w:val="Caption"/>
         <w:keepNext/>
       </w:pPr>
-      <w:bookmarkStart w:id="32" w:name="_Toc242067440"/>
+      <w:bookmarkStart w:id="32" w:name="_Toc242073058"/>
       <w:r>
         <w:t xml:space="preserve">Table </w:t>
       </w:r>
@@ -10098,7 +10170,7 @@
       <w:pPr>
         <w:pStyle w:val="Heading1"/>
       </w:pPr>
-      <w:bookmarkStart w:id="33" w:name="_Toc242067418"/>
+      <w:bookmarkStart w:id="33" w:name="_Toc242073039"/>
       <w:r>
         <w:t>7. SQL Transformation Scripts (Staging → Intermediate)</w:t>
       </w:r>
@@ -10109,7 +10181,7 @@
         <w:pStyle w:val="Caption"/>
         <w:keepNext/>
       </w:pPr>
-      <w:bookmarkStart w:id="34" w:name="_Toc242067441"/>
+      <w:bookmarkStart w:id="34" w:name="_Toc242073059"/>
       <w:r>
         <w:t xml:space="preserve">Table </w:t>
       </w:r>
@@ -10930,7 +11002,7 @@
       <w:pPr>
         <w:pStyle w:val="Heading1"/>
       </w:pPr>
-      <w:bookmarkStart w:id="35" w:name="_Toc242067419"/>
+      <w:bookmarkStart w:id="35" w:name="_Toc242073040"/>
       <w:r>
         <w:t>8. Warehouse Load Scripts (Intermediate → Warehouse)</w:t>
       </w:r>
@@ -10941,7 +11013,7 @@
         <w:pStyle w:val="Caption"/>
         <w:keepNext/>
       </w:pPr>
-      <w:bookmarkStart w:id="36" w:name="_Toc242067442"/>
+      <w:bookmarkStart w:id="36" w:name="_Toc242073060"/>
       <w:r>
         <w:t xml:space="preserve">Table </w:t>
       </w:r>
@@ -11762,7 +11834,7 @@
       <w:pPr>
         <w:pStyle w:val="Heading1"/>
       </w:pPr>
-      <w:bookmarkStart w:id="37" w:name="_Toc242067420"/>
+      <w:bookmarkStart w:id="37" w:name="_Toc242073041"/>
       <w:r>
         <w:t>9. Marts / KPI Views</w:t>
       </w:r>
@@ -11773,7 +11845,7 @@
         <w:pStyle w:val="Caption"/>
         <w:keepNext/>
       </w:pPr>
-      <w:bookmarkStart w:id="38" w:name="_Toc242067443"/>
+      <w:bookmarkStart w:id="38" w:name="_Toc242073061"/>
       <w:r>
         <w:t xml:space="preserve">Table </w:t>
       </w:r>
@@ -12422,7 +12494,7 @@
       <w:pPr>
         <w:pStyle w:val="Heading1"/>
       </w:pPr>
-      <w:bookmarkStart w:id="39" w:name="_Toc242067421"/>
+      <w:bookmarkStart w:id="39" w:name="_Toc242073042"/>
       <w:r>
         <w:t>10. Orchestration &amp; Execution Flow</w:t>
       </w:r>
@@ -12433,7 +12505,7 @@
         <w:pStyle w:val="Caption"/>
         <w:keepNext/>
       </w:pPr>
-      <w:bookmarkStart w:id="40" w:name="_Toc242067444"/>
+      <w:bookmarkStart w:id="40" w:name="_Toc242073062"/>
       <w:r>
         <w:t xml:space="preserve">Table </w:t>
       </w:r>
@@ -13025,7 +13097,7 @@
       <w:pPr>
         <w:pStyle w:val="Heading1"/>
       </w:pPr>
-      <w:bookmarkStart w:id="41" w:name="_Toc242067422"/>
+      <w:bookmarkStart w:id="41" w:name="_Toc242073043"/>
       <w:r>
         <w:t>11. Logging, Monitoring &amp; Notifications</w:t>
       </w:r>
@@ -13309,7 +13381,7 @@
       <w:pPr>
         <w:pStyle w:val="Heading1"/>
       </w:pPr>
-      <w:bookmarkStart w:id="44" w:name="_Toc242067423"/>
+      <w:bookmarkStart w:id="44" w:name="_Toc242073044"/>
       <w:r>
         <w:t>12. Build &amp; Deployment Runbook</w:t>
       </w:r>
@@ -13320,7 +13392,7 @@
         <w:pStyle w:val="Caption"/>
         <w:keepNext/>
       </w:pPr>
-      <w:bookmarkStart w:id="45" w:name="_Toc242067445"/>
+      <w:bookmarkStart w:id="45" w:name="_Toc242073063"/>
       <w:r>
         <w:t xml:space="preserve">Table </w:t>
       </w:r>
@@ -13753,7 +13825,7 @@
       <w:pPr>
         <w:pStyle w:val="Heading1"/>
       </w:pPr>
-      <w:bookmarkStart w:id="46" w:name="_Toc242067424"/>
+      <w:bookmarkStart w:id="46" w:name="_Toc242073045"/>
       <w:r>
         <w:t>13. Version Control &amp; Milestones</w:t>
       </w:r>
@@ -13764,7 +13836,7 @@
         <w:pStyle w:val="Caption"/>
         <w:keepNext/>
       </w:pPr>
-      <w:bookmarkStart w:id="47" w:name="_Toc242067446"/>
+      <w:bookmarkStart w:id="47" w:name="_Toc242073064"/>
       <w:r>
         <w:t xml:space="preserve">Table </w:t>
       </w:r>
@@ -14131,7 +14203,7 @@
           </w:tcPr>
           <w:p>
             <w:r>
-              <w:t>2026-09-30</w:t>
+              <w:t>2026-10-05</w:t>
             </w:r>
           </w:p>
         </w:tc>
@@ -14141,7 +14213,7 @@
           </w:tcPr>
           <w:p>
             <w:r>
-              <w:t>Review fixes</w:t>
+              <w:t>Add transient staging, rejected-records quarantine and integration tests</w:t>
             </w:r>
           </w:p>
         </w:tc>
@@ -14152,17 +14224,161 @@
           <w:p>
             <w:r>
               <w:t>Realistic data, quarantine table, temporary staging, KPI fixes</w:t>
+            </w:r>
+          </w:p>
+        </w:tc>
+      </w:tr>
+      <w:tr>
+        <w:trPr>
+          <w:cantSplit/>
+          <w:jc w:val="center"/>
+        </w:trPr>
+        <w:tc>
+          <w:tcPr>
+            <w:tcW w:w="1283" w:type="dxa"/>
+          </w:tcPr>
+          <w:p>
+            <w:r>
+              <w:t>2026-10-05</w:t>
+            </w:r>
+          </w:p>
+        </w:tc>
+        <w:tc>
+          <w:tcPr>
+            <w:tcW w:w="3870" w:type="dxa"/>
+          </w:tcPr>
+          <w:p>
+            <w:r>
+              <w:t>Add project deliverables, screenshots and updated diagrams (milestone-7)</w:t>
+            </w:r>
+          </w:p>
+        </w:tc>
+        <w:tc>
+          <w:tcPr>
+            <w:tcW w:w="4177" w:type="dxa"/>
+          </w:tcPr>
+          <w:p>
+            <w:r>
+              <w:t>Project documentation complete</w:t>
             </w:r>
           </w:p>
         </w:tc>
       </w:tr>
     </w:tbl>
+    <w:p>
+      <w:pPr>
+        <w:sectPr>
+          <w:headerReference w:type="default" r:id="rId17"/>
+          <w:footerReference w:type="default" r:id="rId18"/>
+          <w:pgSz w:w="11906" w:h="16838"/>
+          <w:pgMar w:top="1134" w:right="1247" w:bottom="1134" w:left="1247" w:header="720" w:footer="720" w:gutter="0"/>
+          <w:cols w:space="720"/>
+          <w:docGrid w:linePitch="360"/>
+        </w:sectPr>
+      </w:pPr>
+    </w:p>
+    <w:p>
+      <w:pPr>
+        <w:keepNext/>
+        <w:jc w:val="center"/>
+      </w:pPr>
+      <w:r>
+        <w:lastRenderedPageBreak/>
+        <w:t>Figure 4 shows the commit history (git log) with the milestone tags.</w:t>
+      </w:r>
+    </w:p>
+    <w:p>
+      <w:pPr>
+        <w:keepNext/>
+        <w:jc w:val="center"/>
+      </w:pPr>
+      <w:r>
+        <w:rPr>
+          <w:noProof/>
+        </w:rPr>
+        <w:drawing>
+          <wp:inline distT="0" distB="0" distL="0" distR="0" wp14:anchorId="4D99A71F" wp14:editId="1AAD21DC">
+            <wp:extent cx="9052560" cy="2049938"/>
+            <wp:effectExtent l="0" t="0" r="0" b="0"/>
+            <wp:docPr id="145" name="Picture 145"/>
+            <wp:cNvGraphicFramePr>
+              <a:graphicFrameLocks xmlns:a="http://schemas.openxmlformats.org/drawingml/2006/main" noChangeAspect="1"/>
+            </wp:cNvGraphicFramePr>
+            <a:graphic xmlns:a="http://schemas.openxmlformats.org/drawingml/2006/main">
+              <a:graphicData uri="http://schemas.openxmlformats.org/drawingml/2006/picture">
+                <pic:pic xmlns:pic="http://schemas.openxmlformats.org/drawingml/2006/picture">
+                  <pic:nvPicPr>
+                    <pic:cNvPr id="0" name="s15-git-log.png"/>
+                    <pic:cNvPicPr/>
+                  </pic:nvPicPr>
+                  <pic:blipFill>
+                    <a:blip r:embed="rId19"/>
+                    <a:stretch>
+                      <a:fillRect/>
+                    </a:stretch>
+                  </pic:blipFill>
+                  <pic:spPr>
+                    <a:xfrm>
+                      <a:off x="0" y="0"/>
+                      <a:ext cx="9052560" cy="2049938"/>
+                    </a:xfrm>
+                    <a:prstGeom prst="rect">
+                      <a:avLst/>
+                    </a:prstGeom>
+                  </pic:spPr>
+                </pic:pic>
+              </a:graphicData>
+            </a:graphic>
+          </wp:inline>
+        </w:drawing>
+      </w:r>
+    </w:p>
+    <w:p>
+      <w:pPr>
+        <w:pStyle w:val="Caption"/>
+        <w:jc w:val="center"/>
+        <w:sectPr>
+          <w:headerReference w:type="default" r:id="rId20"/>
+          <w:footerReference w:type="default" r:id="rId21"/>
+          <w:pgSz w:w="16838" w:h="11906" w:orient="landscape"/>
+          <w:pgMar w:top="1134" w:right="1247" w:bottom="1134" w:left="1247" w:header="720" w:footer="720" w:gutter="0"/>
+          <w:cols w:space="720"/>
+          <w:docGrid w:linePitch="360"/>
+        </w:sectPr>
+      </w:pPr>
+      <w:bookmarkStart w:id="50" w:name="_Toc242067499"/>
+      <w:r>
+        <w:t xml:space="preserve">Figure </w:t>
+      </w:r>
+      <w:r>
+        <w:fldChar w:fldCharType="begin"/>
+      </w:r>
+      <w:r>
+        <w:instrText xml:space="preserve"> SEQ Figure \* ARABIC </w:instrText>
+      </w:r>
+      <w:r>
+        <w:fldChar w:fldCharType="separate"/>
+      </w:r>
+      <w:r>
+        <w:rPr>
+          <w:noProof/>
+        </w:rPr>
+        <w:t>4</w:t>
+      </w:r>
+      <w:r>
+        <w:fldChar w:fldCharType="end"/>
+      </w:r>
+      <w:r>
+        <w:t>: Commit history (git log) with the milestone tags</w:t>
+      </w:r>
+      <w:bookmarkEnd w:id="50"/>
+    </w:p>
     <w:p/>
     <w:p>
       <w:pPr>
         <w:pStyle w:val="Heading1"/>
       </w:pPr>
-      <w:bookmarkStart w:id="48" w:name="_Toc242067425"/>
+      <w:bookmarkStart w:id="48" w:name="_Toc242073046"/>
       <w:r>
         <w:t>14. Known Limitations &amp; Future Work</w:t>
       </w:r>
@@ -14173,7 +14389,7 @@
         <w:pStyle w:val="Caption"/>
         <w:keepNext/>
       </w:pPr>
-      <w:bookmarkStart w:id="49" w:name="_Toc242067447"/>
+      <w:bookmarkStart w:id="49" w:name="_Toc242073065"/>
       <w:r>
         <w:t xml:space="preserve">Table </w:t>
       </w:r>
@@ -14423,8 +14639,8 @@
     </w:tbl>
     <w:p/>
     <w:sectPr>
-      <w:headerReference w:type="default" r:id="rId17"/>
-      <w:footerReference w:type="default" r:id="rId18"/>
+      <w:headerReference w:type="default" r:id="rId22"/>
+      <w:footerReference w:type="default" r:id="rId23"/>
       <w:pgSz w:w="11906" w:h="16838"/>
       <w:pgMar w:top="1134" w:right="1247" w:bottom="1134" w:left="1247" w:header="720" w:footer="720" w:gutter="0"/>
       <w:cols w:space="720"/>
@@ -14560,6 +14776,106 @@
 </file>
 
 <file path=word/footer3.xml><?xml version="1.0" encoding="utf-8"?>
+<w:ftr xmlns:wpc="http://schemas.microsoft.com/office/word/2010/wordprocessingCanvas" xmlns:cx="http://schemas.microsoft.com/office/drawing/2014/chartex" xmlns:cx1="http://schemas.microsoft.com/office/drawing/2015/9/8/chartex" xmlns:cx2="http://schemas.microsoft.com/office/drawing/2015/10/21/chartex" xmlns:cx3="http://schemas.microsoft.com/office/drawing/2016/5/9/chartex" xmlns:cx4="http://schemas.microsoft.com/office/drawing/2016/5/10/chartex" xmlns:cx5="http://schemas.microsoft.com/office/drawing/2016/5/11/chartex" xmlns:cx6="http://schemas.microsoft.com/office/drawing/2016/5/12/chartex" xmlns:cx7="http://schemas.microsoft.com/office/drawing/2016/5/13/chartex" xmlns:cx8="http://schemas.microsoft.com/office/drawing/2016/5/14/chartex" xmlns:mc="http://schemas.openxmlformats.org/markup-compatibility/2006" xmlns:aink="http://schemas.microsoft.com/office/drawing/2016/ink" xmlns:am3d="http://schemas.microsoft.com/office/drawing/2017/model3d" xmlns:o="urn:schemas-microsoft-com:office:office" xmlns:oel="http://schemas.microsoft.com/office/2019/extlst" xmlns:r="http://schemas.openxmlformats.org/officeDocument/2006/relationships" xmlns:m="http://schemas.openxmlformats.org/officeDocument/2006/math" xmlns:v="urn:schemas-microsoft-com:vml" xmlns:wp14="http://schemas.microsoft.com/office/word/2010/wordprocessingDrawing" xmlns:wp="http://schemas.openxmlformats.org/drawingml/2006/wordprocessingDrawing" xmlns:w10="urn:schemas-microsoft-com:office:word" xmlns:w="http://schemas.openxmlformats.org/wordprocessingml/2006/main" xmlns:w14="http://schemas.microsoft.com/office/word/2010/wordml" xmlns:w15="http://schemas.microsoft.com/office/word/2012/wordml" xmlns:w16cex="http://schemas.microsoft.com/office/word/2018/wordml/cex" xmlns:w16cid="http://schemas.microsoft.com/office/word/2016/wordml/cid" xmlns:w16="http://schemas.microsoft.com/office/word/2018/wordml" xmlns:w16du="http://schemas.microsoft.com/office/word/2023/wordml/word16du" xmlns:w16sdtdh="http://schemas.microsoft.com/office/word/2020/wordml/sdtdatahash" xmlns:w16sdtfl="http://schemas.microsoft.com/office/word/2024/wordml/sdtformatlock" xmlns:w16se="http://schemas.microsoft.com/office/word/2015/wordml/symex" xmlns:wpg="http://schemas.microsoft.com/office/word/2010/wordprocessingGroup" xmlns:wpi="http://schemas.microsoft.com/office/word/2010/wordprocessingInk" xmlns:wne="http://schemas.microsoft.com/office/word/2006/wordml" xmlns:wps="http://schemas.microsoft.com/office/word/2010/wordprocessingShape" mc:Ignorable="w14 w15 w16se w16cid w16 w16cex w16sdtdh w16sdtfl w16du wp14">
+  <w:p>
+    <w:pPr>
+      <w:pStyle w:val="Footer"/>
+      <w:jc w:val="right"/>
+    </w:pPr>
+    <w:r>
+      <w:rPr>
+        <w:sz w:val="17"/>
+      </w:rPr>
+      <w:t xml:space="preserve">Page </w:t>
+    </w:r>
+    <w:r>
+      <w:fldChar w:fldCharType="begin"/>
+    </w:r>
+    <w:r>
+      <w:instrText>PAGE</w:instrText>
+    </w:r>
+    <w:r>
+      <w:fldChar w:fldCharType="separate"/>
+    </w:r>
+    <w:r>
+      <w:t>1</w:t>
+    </w:r>
+    <w:r>
+      <w:fldChar w:fldCharType="end"/>
+    </w:r>
+    <w:r>
+      <w:t xml:space="preserve"> of </w:t>
+    </w:r>
+    <w:r>
+      <w:fldChar w:fldCharType="begin"/>
+    </w:r>
+    <w:r>
+      <w:instrText>NUMPAGES</w:instrText>
+    </w:r>
+    <w:r>
+      <w:fldChar w:fldCharType="separate"/>
+    </w:r>
+    <w:r>
+      <w:t>1</w:t>
+    </w:r>
+    <w:r>
+      <w:fldChar w:fldCharType="end"/>
+    </w:r>
+  </w:p>
+</w:ftr>
+</file>
+
+<file path=word/footer4.xml><?xml version="1.0" encoding="utf-8"?>
+<w:ftr xmlns:wpc="http://schemas.microsoft.com/office/word/2010/wordprocessingCanvas" xmlns:cx="http://schemas.microsoft.com/office/drawing/2014/chartex" xmlns:cx1="http://schemas.microsoft.com/office/drawing/2015/9/8/chartex" xmlns:cx2="http://schemas.microsoft.com/office/drawing/2015/10/21/chartex" xmlns:cx3="http://schemas.microsoft.com/office/drawing/2016/5/9/chartex" xmlns:cx4="http://schemas.microsoft.com/office/drawing/2016/5/10/chartex" xmlns:cx5="http://schemas.microsoft.com/office/drawing/2016/5/11/chartex" xmlns:cx6="http://schemas.microsoft.com/office/drawing/2016/5/12/chartex" xmlns:cx7="http://schemas.microsoft.com/office/drawing/2016/5/13/chartex" xmlns:cx8="http://schemas.microsoft.com/office/drawing/2016/5/14/chartex" xmlns:mc="http://schemas.openxmlformats.org/markup-compatibility/2006" xmlns:aink="http://schemas.microsoft.com/office/drawing/2016/ink" xmlns:am3d="http://schemas.microsoft.com/office/drawing/2017/model3d" xmlns:o="urn:schemas-microsoft-com:office:office" xmlns:oel="http://schemas.microsoft.com/office/2019/extlst" xmlns:r="http://schemas.openxmlformats.org/officeDocument/2006/relationships" xmlns:m="http://schemas.openxmlformats.org/officeDocument/2006/math" xmlns:v="urn:schemas-microsoft-com:vml" xmlns:wp14="http://schemas.microsoft.com/office/word/2010/wordprocessingDrawing" xmlns:wp="http://schemas.openxmlformats.org/drawingml/2006/wordprocessingDrawing" xmlns:w10="urn:schemas-microsoft-com:office:word" xmlns:w="http://schemas.openxmlformats.org/wordprocessingml/2006/main" xmlns:w14="http://schemas.microsoft.com/office/word/2010/wordml" xmlns:w15="http://schemas.microsoft.com/office/word/2012/wordml" xmlns:w16cex="http://schemas.microsoft.com/office/word/2018/wordml/cex" xmlns:w16cid="http://schemas.microsoft.com/office/word/2016/wordml/cid" xmlns:w16="http://schemas.microsoft.com/office/word/2018/wordml" xmlns:w16du="http://schemas.microsoft.com/office/word/2023/wordml/word16du" xmlns:w16sdtdh="http://schemas.microsoft.com/office/word/2020/wordml/sdtdatahash" xmlns:w16sdtfl="http://schemas.microsoft.com/office/word/2024/wordml/sdtformatlock" xmlns:w16se="http://schemas.microsoft.com/office/word/2015/wordml/symex" xmlns:wpg="http://schemas.microsoft.com/office/word/2010/wordprocessingGroup" xmlns:wpi="http://schemas.microsoft.com/office/word/2010/wordprocessingInk" xmlns:wne="http://schemas.microsoft.com/office/word/2006/wordml" xmlns:wps="http://schemas.microsoft.com/office/word/2010/wordprocessingShape" mc:Ignorable="w14 w15 w16se w16cid w16 w16cex w16sdtdh w16sdtfl w16du wp14">
+  <w:p>
+    <w:pPr>
+      <w:pStyle w:val="Footer"/>
+      <w:jc w:val="right"/>
+    </w:pPr>
+    <w:r>
+      <w:rPr>
+        <w:sz w:val="17"/>
+      </w:rPr>
+      <w:t xml:space="preserve">Page </w:t>
+    </w:r>
+    <w:r>
+      <w:fldChar w:fldCharType="begin"/>
+    </w:r>
+    <w:r>
+      <w:instrText>PAGE</w:instrText>
+    </w:r>
+    <w:r>
+      <w:fldChar w:fldCharType="separate"/>
+    </w:r>
+    <w:r>
+      <w:t>1</w:t>
+    </w:r>
+    <w:r>
+      <w:fldChar w:fldCharType="end"/>
+    </w:r>
+    <w:r>
+      <w:t xml:space="preserve"> of </w:t>
+    </w:r>
+    <w:r>
+      <w:fldChar w:fldCharType="begin"/>
+    </w:r>
+    <w:r>
+      <w:instrText>NUMPAGES</w:instrText>
+    </w:r>
+    <w:r>
+      <w:fldChar w:fldCharType="separate"/>
+    </w:r>
+    <w:r>
+      <w:t>1</w:t>
+    </w:r>
+    <w:r>
+      <w:fldChar w:fldCharType="end"/>
+    </w:r>
+  </w:p>
+</w:ftr>
+</file>
+
+<file path=word/footer5.xml><?xml version="1.0" encoding="utf-8"?>
 <w:ftr xmlns:wpc="http://schemas.microsoft.com/office/word/2010/wordprocessingCanvas" xmlns:cx="http://schemas.microsoft.com/office/drawing/2014/chartex" xmlns:cx1="http://schemas.microsoft.com/office/drawing/2015/9/8/chartex" xmlns:cx2="http://schemas.microsoft.com/office/drawing/2015/10/21/chartex" xmlns:cx3="http://schemas.microsoft.com/office/drawing/2016/5/9/chartex" xmlns:cx4="http://schemas.microsoft.com/office/drawing/2016/5/10/chartex" xmlns:cx5="http://schemas.microsoft.com/office/drawing/2016/5/11/chartex" xmlns:cx6="http://schemas.microsoft.com/office/drawing/2016/5/12/chartex" xmlns:cx7="http://schemas.microsoft.com/office/drawing/2016/5/13/chartex" xmlns:cx8="http://schemas.microsoft.com/office/drawing/2016/5/14/chartex" xmlns:mc="http://schemas.openxmlformats.org/markup-compatibility/2006" xmlns:aink="http://schemas.microsoft.com/office/drawing/2016/ink" xmlns:am3d="http://schemas.microsoft.com/office/drawing/2017/model3d" xmlns:o="urn:schemas-microsoft-com:office:office" xmlns:oel="http://schemas.microsoft.com/office/2019/extlst" xmlns:r="http://schemas.openxmlformats.org/officeDocument/2006/relationships" xmlns:m="http://schemas.openxmlformats.org/officeDocument/2006/math" xmlns:v="urn:schemas-microsoft-com:vml" xmlns:wp14="http://schemas.microsoft.com/office/word/2010/wordprocessingDrawing" xmlns:wp="http://schemas.openxmlformats.org/drawingml/2006/wordprocessingDrawing" xmlns:w10="urn:schemas-microsoft-com:office:word" xmlns:w="http://schemas.openxmlformats.org/wordprocessingml/2006/main" xmlns:w14="http://schemas.microsoft.com/office/word/2010/wordml" xmlns:w15="http://schemas.microsoft.com/office/word/2012/wordml" xmlns:w16cex="http://schemas.microsoft.com/office/word/2018/wordml/cex" xmlns:w16cid="http://schemas.microsoft.com/office/word/2016/wordml/cid" xmlns:w16="http://schemas.microsoft.com/office/word/2018/wordml" xmlns:w16du="http://schemas.microsoft.com/office/word/2023/wordml/word16du" xmlns:w16sdtdh="http://schemas.microsoft.com/office/word/2020/wordml/sdtdatahash" xmlns:w16sdtfl="http://schemas.microsoft.com/office/word/2024/wordml/sdtformatlock" xmlns:w16se="http://schemas.microsoft.com/office/word/2015/wordml/symex" xmlns:wpg="http://schemas.microsoft.com/office/word/2010/wordprocessingGroup" xmlns:wpi="http://schemas.microsoft.com/office/word/2010/wordprocessingInk" xmlns:wne="http://schemas.microsoft.com/office/word/2006/wordml" xmlns:wps="http://schemas.microsoft.com/office/word/2010/wordprocessingShape" mc:Ignorable="w14 w15 w16se w16cid w16 w16cex w16sdtdh w16sdtfl w16du wp14">
   <w:p>
     <w:pPr>
@@ -14669,6 +14985,40 @@
 </file>
 
 <file path=word/header3.xml><?xml version="1.0" encoding="utf-8"?>
+<w:hdr xmlns:wpc="http://schemas.microsoft.com/office/word/2010/wordprocessingCanvas" xmlns:cx="http://schemas.microsoft.com/office/drawing/2014/chartex" xmlns:cx1="http://schemas.microsoft.com/office/drawing/2015/9/8/chartex" xmlns:cx2="http://schemas.microsoft.com/office/drawing/2015/10/21/chartex" xmlns:cx3="http://schemas.microsoft.com/office/drawing/2016/5/9/chartex" xmlns:cx4="http://schemas.microsoft.com/office/drawing/2016/5/10/chartex" xmlns:cx5="http://schemas.microsoft.com/office/drawing/2016/5/11/chartex" xmlns:cx6="http://schemas.microsoft.com/office/drawing/2016/5/12/chartex" xmlns:cx7="http://schemas.microsoft.com/office/drawing/2016/5/13/chartex" xmlns:cx8="http://schemas.microsoft.com/office/drawing/2016/5/14/chartex" xmlns:mc="http://schemas.openxmlformats.org/markup-compatibility/2006" xmlns:aink="http://schemas.microsoft.com/office/drawing/2016/ink" xmlns:am3d="http://schemas.microsoft.com/office/drawing/2017/model3d" xmlns:o="urn:schemas-microsoft-com:office:office" xmlns:oel="http://schemas.microsoft.com/office/2019/extlst" xmlns:r="http://schemas.openxmlformats.org/officeDocument/2006/relationships" xmlns:m="http://schemas.openxmlformats.org/officeDocument/2006/math" xmlns:v="urn:schemas-microsoft-com:vml" xmlns:wp14="http://schemas.microsoft.com/office/word/2010/wordprocessingDrawing" xmlns:wp="http://schemas.openxmlformats.org/drawingml/2006/wordprocessingDrawing" xmlns:w10="urn:schemas-microsoft-com:office:word" xmlns:w="http://schemas.openxmlformats.org/wordprocessingml/2006/main" xmlns:w14="http://schemas.microsoft.com/office/word/2010/wordml" xmlns:w15="http://schemas.microsoft.com/office/word/2012/wordml" xmlns:w16cex="http://schemas.microsoft.com/office/word/2018/wordml/cex" xmlns:w16cid="http://schemas.microsoft.com/office/word/2016/wordml/cid" xmlns:w16="http://schemas.microsoft.com/office/word/2018/wordml" xmlns:w16du="http://schemas.microsoft.com/office/word/2023/wordml/word16du" xmlns:w16sdtdh="http://schemas.microsoft.com/office/word/2020/wordml/sdtdatahash" xmlns:w16sdtfl="http://schemas.microsoft.com/office/word/2024/wordml/sdtformatlock" xmlns:w16se="http://schemas.microsoft.com/office/word/2015/wordml/symex" xmlns:wpg="http://schemas.microsoft.com/office/word/2010/wordprocessingGroup" xmlns:wpi="http://schemas.microsoft.com/office/word/2010/wordprocessingInk" xmlns:wne="http://schemas.microsoft.com/office/word/2006/wordml" xmlns:wps="http://schemas.microsoft.com/office/word/2010/wordprocessingShape" mc:Ignorable="w14 w15 w16se w16cid w16 w16cex w16sdtdh w16sdtfl w16du wp14">
+  <w:p>
+    <w:pPr>
+      <w:pStyle w:val="Header"/>
+    </w:pPr>
+    <w:r>
+      <w:rPr>
+        <w:color w:val="767E8A"/>
+        <w:sz w:val="17"/>
+      </w:rPr>
+      <w:t>B2B Data Engineering Platform  ·  07 Development Document</w:t>
+    </w:r>
+  </w:p>
+</w:hdr>
+</file>
+
+<file path=word/header4.xml><?xml version="1.0" encoding="utf-8"?>
+<w:hdr xmlns:wpc="http://schemas.microsoft.com/office/word/2010/wordprocessingCanvas" xmlns:cx="http://schemas.microsoft.com/office/drawing/2014/chartex" xmlns:cx1="http://schemas.microsoft.com/office/drawing/2015/9/8/chartex" xmlns:cx2="http://schemas.microsoft.com/office/drawing/2015/10/21/chartex" xmlns:cx3="http://schemas.microsoft.com/office/drawing/2016/5/9/chartex" xmlns:cx4="http://schemas.microsoft.com/office/drawing/2016/5/10/chartex" xmlns:cx5="http://schemas.microsoft.com/office/drawing/2016/5/11/chartex" xmlns:cx6="http://schemas.microsoft.com/office/drawing/2016/5/12/chartex" xmlns:cx7="http://schemas.microsoft.com/office/drawing/2016/5/13/chartex" xmlns:cx8="http://schemas.microsoft.com/office/drawing/2016/5/14/chartex" xmlns:mc="http://schemas.openxmlformats.org/markup-compatibility/2006" xmlns:aink="http://schemas.microsoft.com/office/drawing/2016/ink" xmlns:am3d="http://schemas.microsoft.com/office/drawing/2017/model3d" xmlns:o="urn:schemas-microsoft-com:office:office" xmlns:oel="http://schemas.microsoft.com/office/2019/extlst" xmlns:r="http://schemas.openxmlformats.org/officeDocument/2006/relationships" xmlns:m="http://schemas.openxmlformats.org/officeDocument/2006/math" xmlns:v="urn:schemas-microsoft-com:vml" xmlns:wp14="http://schemas.microsoft.com/office/word/2010/wordprocessingDrawing" xmlns:wp="http://schemas.openxmlformats.org/drawingml/2006/wordprocessingDrawing" xmlns:w10="urn:schemas-microsoft-com:office:word" xmlns:w="http://schemas.openxmlformats.org/wordprocessingml/2006/main" xmlns:w14="http://schemas.microsoft.com/office/word/2010/wordml" xmlns:w15="http://schemas.microsoft.com/office/word/2012/wordml" xmlns:w16cex="http://schemas.microsoft.com/office/word/2018/wordml/cex" xmlns:w16cid="http://schemas.microsoft.com/office/word/2016/wordml/cid" xmlns:w16="http://schemas.microsoft.com/office/word/2018/wordml" xmlns:w16du="http://schemas.microsoft.com/office/word/2023/wordml/word16du" xmlns:w16sdtdh="http://schemas.microsoft.com/office/word/2020/wordml/sdtdatahash" xmlns:w16sdtfl="http://schemas.microsoft.com/office/word/2024/wordml/sdtformatlock" xmlns:w16se="http://schemas.microsoft.com/office/word/2015/wordml/symex" xmlns:wpg="http://schemas.microsoft.com/office/word/2010/wordprocessingGroup" xmlns:wpi="http://schemas.microsoft.com/office/word/2010/wordprocessingInk" xmlns:wne="http://schemas.microsoft.com/office/word/2006/wordml" xmlns:wps="http://schemas.microsoft.com/office/word/2010/wordprocessingShape" mc:Ignorable="w14 w15 w16se w16cid w16 w16cex w16sdtdh w16sdtfl w16du wp14">
+  <w:p>
+    <w:pPr>
+      <w:pStyle w:val="Header"/>
+    </w:pPr>
+    <w:r>
+      <w:rPr>
+        <w:color w:val="767E8A"/>
+        <w:sz w:val="17"/>
+      </w:rPr>
+      <w:t>B2B Data Engineering Platform  ·  07 Development Document</w:t>
+    </w:r>
+  </w:p>
+</w:hdr>
+</file>
+
+<file path=word/header5.xml><?xml version="1.0" encoding="utf-8"?>
 <w:hdr xmlns:wpc="http://schemas.microsoft.com/office/word/2010/wordprocessingCanvas" xmlns:cx="http://schemas.microsoft.com/office/drawing/2014/chartex" xmlns:cx1="http://schemas.microsoft.com/office/drawing/2015/9/8/chartex" xmlns:cx2="http://schemas.microsoft.com/office/drawing/2015/10/21/chartex" xmlns:cx3="http://schemas.microsoft.com/office/drawing/2016/5/9/chartex" xmlns:cx4="http://schemas.microsoft.com/office/drawing/2016/5/10/chartex" xmlns:cx5="http://schemas.microsoft.com/office/drawing/2016/5/11/chartex" xmlns:cx6="http://schemas.microsoft.com/office/drawing/2016/5/12/chartex" xmlns:cx7="http://schemas.microsoft.com/office/drawing/2016/5/13/chartex" xmlns:cx8="http://schemas.microsoft.com/office/drawing/2016/5/14/chartex" xmlns:mc="http://schemas.openxmlformats.org/markup-compatibility/2006" xmlns:aink="http://schemas.microsoft.com/office/drawing/2016/ink" xmlns:am3d="http://schemas.microsoft.com/office/drawing/2017/model3d" xmlns:o="urn:schemas-microsoft-com:office:office" xmlns:oel="http://schemas.microsoft.com/office/2019/extlst" xmlns:r="http://schemas.openxmlformats.org/officeDocument/2006/relationships" xmlns:m="http://schemas.openxmlformats.org/officeDocument/2006/math" xmlns:v="urn:schemas-microsoft-com:vml" xmlns:wp14="http://schemas.microsoft.com/office/word/2010/wordprocessingDrawing" xmlns:wp="http://schemas.openxmlformats.org/drawingml/2006/wordprocessingDrawing" xmlns:w10="urn:schemas-microsoft-com:office:word" xmlns:w="http://schemas.openxmlformats.org/wordprocessingml/2006/main" xmlns:w14="http://schemas.microsoft.com/office/word/2010/wordml" xmlns:w15="http://schemas.microsoft.com/office/word/2012/wordml" xmlns:w16cex="http://schemas.microsoft.com/office/word/2018/wordml/cex" xmlns:w16cid="http://schemas.microsoft.com/office/word/2016/wordml/cid" xmlns:w16="http://schemas.microsoft.com/office/word/2018/wordml" xmlns:w16du="http://schemas.microsoft.com/office/word/2023/wordml/word16du" xmlns:w16sdtdh="http://schemas.microsoft.com/office/word/2020/wordml/sdtdatahash" xmlns:w16sdtfl="http://schemas.microsoft.com/office/word/2024/wordml/sdtformatlock" xmlns:w16se="http://schemas.microsoft.com/office/word/2015/wordml/symex" xmlns:wpg="http://schemas.microsoft.com/office/word/2010/wordprocessingGroup" xmlns:wpi="http://schemas.microsoft.com/office/word/2010/wordprocessingInk" xmlns:wne="http://schemas.microsoft.com/office/word/2006/wordml" xmlns:wps="http://schemas.microsoft.com/office/word/2010/wordprocessingShape" mc:Ignorable="w14 w15 w16se w16cid w16 w16cex w16sdtdh w16sdtfl w16du wp14">
   <w:p>
     <w:pPr>
@@ -27654,7 +28004,9 @@
     <w:rsid w:val="00011F41"/>
     <w:rsid w:val="000B5216"/>
     <w:rsid w:val="003D19EB"/>
+    <w:rsid w:val="003D7814"/>
     <w:rsid w:val="008A547D"/>
+    <w:rsid w:val="00964B6B"/>
     <w:rsid w:val="00A701F8"/>
     <w:rsid w:val="00D85AFB"/>
     <w:rsid w:val="00D87C08"/>

</xml_diff>